<commit_message>
DId something for netlify
</commit_message>
<xml_diff>
--- a/modifications.docx
+++ b/modifications.docx
@@ -4,10 +4,15 @@
   <w:body>
     <w:p>
       <w:pPr>
+        <w:numPr>
+          <w:ilvl w:val="0"/>
+          <w:numId w:val="1"/>
+        </w:numPr>
         <w:pBdr>
           <w:bottom w:val="single" w:color="2E75B6" w:sz="6" w:space="4"/>
         </w:pBdr>
         <w:spacing w:after="300"/>
+        <w:ind w:left="420" w:leftChars="0" w:hanging="420" w:firstLineChars="0"/>
       </w:pPr>
       <w:r>
         <w:rPr>
@@ -21,7 +26,12 @@
     </w:p>
     <w:p>
       <w:pPr>
+        <w:numPr>
+          <w:ilvl w:val="0"/>
+          <w:numId w:val="1"/>
+        </w:numPr>
         <w:spacing w:before="200" w:after="120"/>
+        <w:ind w:left="420" w:leftChars="0" w:hanging="420" w:firstLineChars="0"/>
       </w:pPr>
       <w:r>
         <w:rPr>
@@ -42,8 +52,15 @@
           <w:numId w:val="1"/>
         </w:numPr>
         <w:spacing w:after="80"/>
-      </w:pPr>
-      <w:r>
+        <w:ind w:left="420" w:leftChars="0" w:hanging="420" w:firstLineChars="0"/>
+        <w:rPr>
+          <w:highlight w:val="yellow"/>
+        </w:rPr>
+      </w:pPr>
+      <w:r>
+        <w:rPr>
+          <w:highlight w:val="yellow"/>
+        </w:rPr>
         <w:t>Only four training modes to be shown</w:t>
       </w:r>
     </w:p>
@@ -55,18 +72,29 @@
           <w:numId w:val="1"/>
         </w:numPr>
         <w:spacing w:after="80"/>
-      </w:pPr>
-      <w:r>
+        <w:ind w:left="420" w:leftChars="0" w:hanging="420" w:firstLineChars="0"/>
+        <w:rPr>
+          <w:highlight w:val="yellow"/>
+        </w:rPr>
+      </w:pPr>
+      <w:r>
+        <w:rPr>
+          <w:highlight w:val="yellow"/>
+        </w:rPr>
         <w:t>Tip of the day to be placed on the</w:t>
       </w:r>
       <w:r>
         <w:rPr>
           <w:rFonts w:hint="default"/>
+          <w:highlight w:val="yellow"/>
           <w:lang w:val="en-US"/>
         </w:rPr>
         <w:t xml:space="preserve"> top</w:t>
       </w:r>
       <w:r>
+        <w:rPr>
+          <w:highlight w:val="yellow"/>
+        </w:rPr>
         <w:t xml:space="preserve"> or somewhere visible — not at the bottom, as users may have to scroll down every time</w:t>
       </w:r>
     </w:p>
@@ -78,14 +106,26 @@
           <w:numId w:val="1"/>
         </w:numPr>
         <w:spacing w:after="80"/>
-      </w:pPr>
-      <w:r>
+        <w:ind w:left="420" w:leftChars="0" w:hanging="420" w:firstLineChars="0"/>
+        <w:rPr>
+          <w:highlight w:val="red"/>
+        </w:rPr>
+      </w:pPr>
+      <w:r>
+        <w:rPr>
+          <w:highlight w:val="red"/>
+        </w:rPr>
         <w:t>Each tab like hospital should have a picture at the background imparting a better look or we can make it look like if the questioning is happening inside the hospital or industry to increase realism</w:t>
       </w:r>
     </w:p>
     <w:p>
       <w:pPr>
+        <w:numPr>
+          <w:ilvl w:val="0"/>
+          <w:numId w:val="1"/>
+        </w:numPr>
         <w:spacing w:before="280" w:after="120"/>
+        <w:ind w:left="420" w:leftChars="0" w:hanging="420" w:firstLineChars="0"/>
       </w:pPr>
       <w:r>
         <w:rPr>
@@ -106,8 +146,15 @@
           <w:numId w:val="1"/>
         </w:numPr>
         <w:spacing w:after="80"/>
-      </w:pPr>
-      <w:r>
+        <w:ind w:left="420" w:leftChars="0" w:hanging="420" w:firstLineChars="0"/>
+        <w:rPr>
+          <w:highlight w:val="yellow"/>
+        </w:rPr>
+      </w:pPr>
+      <w:r>
+        <w:rPr>
+          <w:highlight w:val="yellow"/>
+        </w:rPr>
         <w:t>Rx and OTC to be merged</w:t>
       </w:r>
     </w:p>
@@ -119,8 +166,15 @@
           <w:numId w:val="1"/>
         </w:numPr>
         <w:spacing w:after="80"/>
-      </w:pPr>
-      <w:r>
+        <w:ind w:left="420" w:leftChars="0" w:hanging="420" w:firstLineChars="0"/>
+        <w:rPr>
+          <w:highlight w:val="yellow"/>
+        </w:rPr>
+      </w:pPr>
+      <w:r>
+        <w:rPr>
+          <w:highlight w:val="yellow"/>
+        </w:rPr>
         <w:t>In Rx, realistic prescriptions in scribbled handwriting are needed to make it more challenging</w:t>
       </w:r>
     </w:p>
@@ -132,8 +186,15 @@
           <w:numId w:val="1"/>
         </w:numPr>
         <w:spacing w:after="80"/>
-      </w:pPr>
-      <w:r>
+        <w:ind w:left="420" w:leftChars="0" w:hanging="420" w:firstLineChars="0"/>
+        <w:rPr>
+          <w:highlight w:val="yellow"/>
+        </w:rPr>
+      </w:pPr>
+      <w:r>
+        <w:rPr>
+          <w:highlight w:val="yellow"/>
+        </w:rPr>
         <w:t>In Rx, the option that appears after selecting the prescribed drug is positioned at the bottom — this took time to find; needs to be more visible</w:t>
       </w:r>
     </w:p>
@@ -145,8 +206,15 @@
           <w:numId w:val="1"/>
         </w:numPr>
         <w:spacing w:after="80"/>
-      </w:pPr>
-      <w:r>
+        <w:ind w:left="420" w:leftChars="0" w:hanging="420" w:firstLineChars="0"/>
+        <w:rPr>
+          <w:highlight w:val="cyan"/>
+        </w:rPr>
+      </w:pPr>
+      <w:r>
+        <w:rPr>
+          <w:highlight w:val="cyan"/>
+        </w:rPr>
         <w:t>Hospital mode to be added</w:t>
       </w:r>
     </w:p>
@@ -158,8 +226,15 @@
           <w:numId w:val="1"/>
         </w:numPr>
         <w:spacing w:after="80"/>
-      </w:pPr>
-      <w:r>
+        <w:ind w:left="420" w:leftChars="0" w:hanging="420" w:firstLineChars="0"/>
+        <w:rPr>
+          <w:highlight w:val="yellow"/>
+        </w:rPr>
+      </w:pPr>
+      <w:r>
+        <w:rPr>
+          <w:highlight w:val="yellow"/>
+        </w:rPr>
         <w:t>Oncology and cosmetics to be removed</w:t>
       </w:r>
     </w:p>
@@ -171,8 +246,15 @@
           <w:numId w:val="1"/>
         </w:numPr>
         <w:spacing w:after="80"/>
-      </w:pPr>
-      <w:r>
+        <w:ind w:left="420" w:leftChars="0" w:hanging="420" w:firstLineChars="0"/>
+        <w:rPr>
+          <w:highlight w:val="yellow"/>
+        </w:rPr>
+      </w:pPr>
+      <w:r>
+        <w:rPr>
+          <w:highlight w:val="yellow"/>
+        </w:rPr>
         <w:t xml:space="preserve">Time tickling on the upper tab should be little more visible </w:t>
       </w:r>
     </w:p>
@@ -184,8 +266,15 @@
           <w:numId w:val="1"/>
         </w:numPr>
         <w:spacing w:after="80"/>
-      </w:pPr>
-      <w:r>
+        <w:ind w:left="420" w:leftChars="0" w:hanging="420" w:firstLineChars="0"/>
+        <w:rPr>
+          <w:highlight w:val="yellow"/>
+        </w:rPr>
+      </w:pPr>
+      <w:r>
+        <w:rPr>
+          <w:highlight w:val="yellow"/>
+        </w:rPr>
         <w:t>Industry: the master formula is too complex to absorb at a glance — consider displaying it alongside the training modes for better understanding</w:t>
       </w:r>
     </w:p>
@@ -197,8 +286,15 @@
           <w:numId w:val="1"/>
         </w:numPr>
         <w:spacing w:after="80"/>
-      </w:pPr>
-      <w:r>
+        <w:ind w:left="420" w:leftChars="0" w:hanging="420" w:firstLineChars="0"/>
+        <w:rPr>
+          <w:highlight w:val="yellow"/>
+        </w:rPr>
+      </w:pPr>
+      <w:r>
+        <w:rPr>
+          <w:highlight w:val="yellow"/>
+        </w:rPr>
         <w:t>Warehouse needs more complex cases</w:t>
       </w:r>
     </w:p>
@@ -210,8 +306,15 @@
           <w:numId w:val="1"/>
         </w:numPr>
         <w:spacing w:after="80"/>
-      </w:pPr>
-      <w:r>
+        <w:ind w:left="420" w:leftChars="0" w:hanging="420" w:firstLineChars="0"/>
+        <w:rPr>
+          <w:highlight w:val="red"/>
+        </w:rPr>
+      </w:pPr>
+      <w:r>
+        <w:rPr>
+          <w:highlight w:val="red"/>
+        </w:rPr>
         <w:t xml:space="preserve">Streak management like snapchat </w:t>
       </w:r>
     </w:p>
@@ -223,72 +326,77 @@
           <w:numId w:val="1"/>
         </w:numPr>
         <w:spacing w:after="80"/>
-      </w:pPr>
-      <w:r>
+        <w:ind w:left="420" w:leftChars="0" w:hanging="420" w:firstLineChars="0"/>
+        <w:rPr>
+          <w:highlight w:val="red"/>
+        </w:rPr>
+      </w:pPr>
+      <w:r>
+        <w:rPr>
+          <w:highlight w:val="red"/>
+        </w:rPr>
         <w:t xml:space="preserve">Remove the hard easy specification over the training </w:t>
       </w:r>
     </w:p>
     <w:p>
       <w:pPr>
         <w:pStyle w:val="17"/>
+        <w:numPr>
+          <w:ilvl w:val="0"/>
+          <w:numId w:val="1"/>
+        </w:numPr>
+        <w:spacing w:after="80"/>
+        <w:ind w:left="420" w:leftChars="0" w:hanging="420" w:firstLineChars="0"/>
+        <w:rPr>
+          <w:highlight w:val="yellow"/>
+        </w:rPr>
+      </w:pPr>
+      <w:r>
+        <w:rPr>
+          <w:highlight w:val="yellow"/>
+        </w:rPr>
+        <w:t>Fix bugs here what is the issue here I opened hospital pharmacy</w:t>
+      </w:r>
+    </w:p>
+    <w:p>
+      <w:pPr>
+        <w:pStyle w:val="17"/>
         <w:spacing w:after="80"/>
         <w:ind w:left="720"/>
-      </w:pPr>
-      <w:r>
-        <w:t>Fix bugs here what is the issue here I opened hospital pharmacy</w:t>
-      </w:r>
-      <w:r>
-        <w:drawing>
-          <wp:inline distT="0" distB="0" distL="0" distR="0">
-            <wp:extent cx="5943600" cy="2910205"/>
-            <wp:effectExtent l="0" t="0" r="0" b="4445"/>
-            <wp:docPr id="672925279" name="Picture 1"/>
-            <wp:cNvGraphicFramePr>
-              <a:graphicFrameLocks xmlns:a="http://schemas.openxmlformats.org/drawingml/2006/main" noChangeAspect="1"/>
-            </wp:cNvGraphicFramePr>
-            <a:graphic xmlns:a="http://schemas.openxmlformats.org/drawingml/2006/main">
-              <a:graphicData uri="http://schemas.openxmlformats.org/drawingml/2006/picture">
-                <pic:pic xmlns:pic="http://schemas.openxmlformats.org/drawingml/2006/picture">
-                  <pic:nvPicPr>
-                    <pic:cNvPr id="672925279" name="Picture 1"/>
-                    <pic:cNvPicPr>
-                      <a:picLocks noChangeAspect="1"/>
-                    </pic:cNvPicPr>
-                  </pic:nvPicPr>
-                  <pic:blipFill>
-                    <a:blip r:embed="rId4" cstate="print">
-                      <a:extLst>
-                        <a:ext uri="{28A0092B-C50C-407E-A947-70E740481C1C}">
-                          <a14:useLocalDpi xmlns:a14="http://schemas.microsoft.com/office/drawing/2010/main" val="0"/>
-                        </a:ext>
-                      </a:extLst>
-                    </a:blip>
-                    <a:stretch>
-                      <a:fillRect/>
-                    </a:stretch>
-                  </pic:blipFill>
-                  <pic:spPr>
-                    <a:xfrm>
-                      <a:off x="0" y="0"/>
-                      <a:ext cx="5943600" cy="2910205"/>
-                    </a:xfrm>
-                    <a:prstGeom prst="rect">
-                      <a:avLst/>
-                    </a:prstGeom>
-                  </pic:spPr>
-                </pic:pic>
-              </a:graphicData>
-            </a:graphic>
-          </wp:inline>
-        </w:drawing>
-      </w:r>
+        <w:rPr>
+          <w:highlight w:val="yellow"/>
+        </w:rPr>
+      </w:pPr>
     </w:p>
     <w:p>
       <w:pPr>
         <w:pStyle w:val="17"/>
         <w:spacing w:after="80"/>
         <w:ind w:left="720"/>
-      </w:pPr>
+        <w:rPr>
+          <w:highlight w:val="yellow"/>
+        </w:rPr>
+      </w:pPr>
+    </w:p>
+    <w:p>
+      <w:pPr>
+        <w:pStyle w:val="17"/>
+        <w:numPr>
+          <w:ilvl w:val="0"/>
+          <w:numId w:val="1"/>
+        </w:numPr>
+        <w:spacing w:after="80"/>
+        <w:ind w:left="420" w:leftChars="0" w:hanging="420" w:firstLineChars="0"/>
+        <w:rPr>
+          <w:highlight w:val="yellow"/>
+        </w:rPr>
+      </w:pPr>
+      <w:r>
+        <w:rPr>
+          <w:highlight w:val="yellow"/>
+        </w:rPr>
+        <w:t>What Is the issue here, in the prescription bar why proper prescription is not available.</w:t>
+      </w:r>
     </w:p>
     <w:p>
       <w:pPr>
@@ -303,9 +411,6 @@
         <w:spacing w:after="80"/>
         <w:ind w:left="720"/>
       </w:pPr>
-      <w:r>
-        <w:t>What Is the issue here, in the prescription bar why proper prescription is not available.</w:t>
-      </w:r>
     </w:p>
     <w:p>
       <w:pPr>
@@ -317,54 +422,23 @@
     <w:p>
       <w:pPr>
         <w:pStyle w:val="17"/>
+        <w:numPr>
+          <w:ilvl w:val="0"/>
+          <w:numId w:val="1"/>
+        </w:numPr>
+        <w:spacing w:after="80"/>
+        <w:ind w:left="420" w:leftChars="0" w:hanging="420" w:firstLineChars="0"/>
+      </w:pPr>
+      <w:r>
+        <w:t xml:space="preserve">Compounding of topical dosage form (lotions ,creams, gels) ,sterile intravenous preparations, TPN , antibiotic dilutions. Under community pharmacy </w:t>
+      </w:r>
+    </w:p>
+    <w:p>
+      <w:pPr>
+        <w:pStyle w:val="17"/>
         <w:spacing w:after="80"/>
         <w:ind w:left="720"/>
       </w:pPr>
-      <w:r>
-        <w:drawing>
-          <wp:inline distT="0" distB="0" distL="0" distR="0">
-            <wp:extent cx="5943600" cy="3947795"/>
-            <wp:effectExtent l="0" t="0" r="0" b="0"/>
-            <wp:docPr id="888486072" name="Picture 2"/>
-            <wp:cNvGraphicFramePr>
-              <a:graphicFrameLocks xmlns:a="http://schemas.openxmlformats.org/drawingml/2006/main" noChangeAspect="1"/>
-            </wp:cNvGraphicFramePr>
-            <a:graphic xmlns:a="http://schemas.openxmlformats.org/drawingml/2006/main">
-              <a:graphicData uri="http://schemas.openxmlformats.org/drawingml/2006/picture">
-                <pic:pic xmlns:pic="http://schemas.openxmlformats.org/drawingml/2006/picture">
-                  <pic:nvPicPr>
-                    <pic:cNvPr id="888486072" name="Picture 2"/>
-                    <pic:cNvPicPr>
-                      <a:picLocks noChangeAspect="1"/>
-                    </pic:cNvPicPr>
-                  </pic:nvPicPr>
-                  <pic:blipFill>
-                    <a:blip r:embed="rId5">
-                      <a:extLst>
-                        <a:ext uri="{28A0092B-C50C-407E-A947-70E740481C1C}">
-                          <a14:useLocalDpi xmlns:a14="http://schemas.microsoft.com/office/drawing/2010/main" val="0"/>
-                        </a:ext>
-                      </a:extLst>
-                    </a:blip>
-                    <a:stretch>
-                      <a:fillRect/>
-                    </a:stretch>
-                  </pic:blipFill>
-                  <pic:spPr>
-                    <a:xfrm>
-                      <a:off x="0" y="0"/>
-                      <a:ext cx="5943600" cy="3947795"/>
-                    </a:xfrm>
-                    <a:prstGeom prst="rect">
-                      <a:avLst/>
-                    </a:prstGeom>
-                  </pic:spPr>
-                </pic:pic>
-              </a:graphicData>
-            </a:graphic>
-          </wp:inline>
-        </w:drawing>
-      </w:r>
     </w:p>
     <w:p>
       <w:pPr>
@@ -375,47 +449,12 @@
     </w:p>
     <w:p>
       <w:pPr>
-        <w:pStyle w:val="17"/>
-        <w:numPr>
-          <w:ilvl w:val="0"/>
-          <w:numId w:val="2"/>
-        </w:numPr>
-        <w:spacing w:after="80"/>
-      </w:pPr>
-      <w:r>
-        <w:t>Add vaccination in community as well, that will include reviewing of vaccination charts of kids or maybe associated symptoms of vaccination.</w:t>
-      </w:r>
-    </w:p>
-    <w:p>
-      <w:pPr>
-        <w:pStyle w:val="17"/>
-        <w:numPr>
-          <w:ilvl w:val="0"/>
-          <w:numId w:val="2"/>
-        </w:numPr>
-        <w:spacing w:after="80"/>
-      </w:pPr>
-      <w:r>
-        <w:t xml:space="preserve">Compounding of topical dosage form (lotions ,creams, gels) ,sterile intravenous preparations, TPN , antibiotic dilutions. Under community pharmacy </w:t>
-      </w:r>
-    </w:p>
-    <w:p>
-      <w:pPr>
-        <w:pStyle w:val="17"/>
-        <w:spacing w:after="80"/>
-        <w:ind w:left="720"/>
-      </w:pPr>
-    </w:p>
-    <w:p>
-      <w:pPr>
-        <w:pStyle w:val="17"/>
-        <w:spacing w:after="80"/>
-        <w:ind w:left="720"/>
-      </w:pPr>
-    </w:p>
-    <w:p>
-      <w:pPr>
+        <w:numPr>
+          <w:ilvl w:val="0"/>
+          <w:numId w:val="1"/>
+        </w:numPr>
         <w:spacing w:before="280" w:after="120"/>
+        <w:ind w:left="420" w:leftChars="0" w:hanging="420" w:firstLineChars="0"/>
       </w:pPr>
       <w:r>
         <w:rPr>
@@ -430,7 +469,12 @@
     </w:p>
     <w:p>
       <w:pPr>
+        <w:numPr>
+          <w:ilvl w:val="0"/>
+          <w:numId w:val="1"/>
+        </w:numPr>
         <w:spacing w:after="100"/>
+        <w:ind w:left="420" w:leftChars="0" w:hanging="420" w:firstLineChars="0"/>
       </w:pPr>
       <w:r>
         <w:t>Profile is perfect, and so is the leaderboard.</w:t>
@@ -438,190 +482,268 @@
     </w:p>
     <w:p>
       <w:pPr>
+        <w:numPr>
+          <w:ilvl w:val="0"/>
+          <w:numId w:val="1"/>
+        </w:numPr>
         <w:spacing w:before="280" w:after="120"/>
-      </w:pPr>
-      <w:r>
-        <w:rPr>
+        <w:ind w:left="420" w:leftChars="0" w:hanging="420" w:firstLineChars="0"/>
+      </w:pPr>
+    </w:p>
+    <w:p>
+      <w:pPr>
+        <w:numPr>
+          <w:ilvl w:val="0"/>
+          <w:numId w:val="0"/>
+        </w:numPr>
+        <w:spacing w:after="100"/>
+        <w:ind w:leftChars="0"/>
+        <w:rPr>
+          <w:highlight w:val="yellow"/>
+        </w:rPr>
+      </w:pPr>
+      <w:r>
+        <w:rPr>
+          <w:rFonts w:hint="default"/>
           <w:b/>
           <w:bCs/>
           <w:color w:val="2E75B6"/>
           <w:sz w:val="26"/>
           <w:szCs w:val="26"/>
-        </w:rPr>
-        <w:t>Other</w:t>
-      </w:r>
-    </w:p>
-    <w:p>
-      <w:pPr>
+          <w:lang w:val="en-US"/>
+        </w:rPr>
+        <w:t>Call wali:</w:t>
+      </w:r>
+    </w:p>
+    <w:p>
+      <w:pPr>
+        <w:numPr>
+          <w:ilvl w:val="0"/>
+          <w:numId w:val="1"/>
+        </w:numPr>
         <w:spacing w:after="100"/>
-      </w:pPr>
-      <w:r>
+        <w:ind w:left="420" w:leftChars="0" w:hanging="420" w:firstLineChars="0"/>
+        <w:rPr>
+          <w:highlight w:val="yellow"/>
+        </w:rPr>
+      </w:pPr>
+      <w:r>
+        <w:rPr>
+          <w:highlight w:val="yellow"/>
+        </w:rPr>
         <w:t xml:space="preserve">Consider changing the name </w:t>
       </w:r>
       <w:r>
         <w:rPr>
           <w:rFonts w:hint="default"/>
+          <w:highlight w:val="yellow"/>
           <w:lang w:val="en-US"/>
         </w:rPr>
         <w:t>To pharmulation</w:t>
       </w:r>
       <w:r>
+        <w:rPr>
+          <w:highlight w:val="yellow"/>
+        </w:rPr>
         <w:t>.</w:t>
       </w:r>
     </w:p>
     <w:p>
       <w:pPr>
+        <w:numPr>
+          <w:ilvl w:val="0"/>
+          <w:numId w:val="1"/>
+        </w:numPr>
         <w:spacing w:after="100"/>
-        <w:rPr>
-          <w:rFonts w:hint="default"/>
+        <w:ind w:left="420" w:leftChars="0" w:hanging="420" w:firstLineChars="0"/>
+        <w:rPr>
+          <w:rFonts w:hint="default"/>
+          <w:highlight w:val="yellow"/>
+        </w:rPr>
+      </w:pPr>
+      <w:r>
+        <w:rPr>
+          <w:rFonts w:hint="default"/>
+          <w:highlight w:val="yellow"/>
+        </w:rPr>
+        <w:t>2. only 2 options of student occupation in sign up</w:t>
+      </w:r>
+    </w:p>
+    <w:p>
+      <w:pPr>
+        <w:numPr>
+          <w:ilvl w:val="0"/>
+          <w:numId w:val="1"/>
+        </w:numPr>
+        <w:spacing w:after="100"/>
+        <w:ind w:left="420" w:leftChars="0" w:hanging="420" w:firstLineChars="0"/>
+        <w:rPr>
+          <w:rFonts w:hint="default"/>
+          <w:highlight w:val="yellow"/>
+        </w:rPr>
+      </w:pPr>
+      <w:r>
+        <w:rPr>
+          <w:rFonts w:hint="default"/>
+          <w:highlight w:val="yellow"/>
+        </w:rPr>
+        <w:t>3. Tip of the day at the top</w:t>
+      </w:r>
+    </w:p>
+    <w:p>
+      <w:pPr>
+        <w:numPr>
+          <w:ilvl w:val="0"/>
+          <w:numId w:val="1"/>
+        </w:numPr>
+        <w:spacing w:after="100"/>
+        <w:ind w:left="420" w:leftChars="0" w:hanging="420" w:firstLineChars="0"/>
+        <w:rPr>
+          <w:rFonts w:hint="default"/>
+          <w:highlight w:val="yellow"/>
+        </w:rPr>
+      </w:pPr>
+      <w:r>
+        <w:rPr>
+          <w:rFonts w:hint="default"/>
+          <w:highlight w:val="yellow"/>
+        </w:rPr>
+        <w:t>4. Prescription sahi krna hai</w:t>
+      </w:r>
+    </w:p>
+    <w:p>
+      <w:pPr>
+        <w:numPr>
+          <w:ilvl w:val="0"/>
+          <w:numId w:val="1"/>
+        </w:numPr>
+        <w:spacing w:after="100"/>
+        <w:ind w:left="420" w:leftChars="0" w:hanging="420" w:firstLineChars="0"/>
+        <w:rPr>
+          <w:rFonts w:hint="default"/>
+          <w:highlight w:val="yellow"/>
+        </w:rPr>
+      </w:pPr>
+      <w:r>
+        <w:rPr>
+          <w:rFonts w:hint="default"/>
+          <w:highlight w:val="yellow"/>
+        </w:rPr>
+        <w:t>5. Ticking clock</w:t>
+      </w:r>
+    </w:p>
+    <w:p>
+      <w:pPr>
+        <w:numPr>
+          <w:ilvl w:val="0"/>
+          <w:numId w:val="1"/>
+        </w:numPr>
+        <w:spacing w:after="100"/>
+        <w:ind w:left="420" w:leftChars="0" w:hanging="420" w:firstLineChars="0"/>
+        <w:rPr>
+          <w:rFonts w:hint="default"/>
+          <w:highlight w:val="yellow"/>
+        </w:rPr>
+      </w:pPr>
+      <w:r>
+        <w:rPr>
+          <w:rFonts w:hint="default"/>
+          <w:highlight w:val="yellow"/>
+        </w:rPr>
+        <w:t>6. Har mode ka apna aik difficulty level</w:t>
+      </w:r>
+    </w:p>
+    <w:p>
+      <w:pPr>
+        <w:numPr>
+          <w:ilvl w:val="0"/>
+          <w:numId w:val="1"/>
+        </w:numPr>
+        <w:spacing w:after="100"/>
+        <w:ind w:left="420" w:leftChars="0" w:hanging="420" w:firstLineChars="0"/>
+        <w:rPr>
+          <w:rFonts w:hint="default"/>
+        </w:rPr>
+      </w:pPr>
+      <w:r>
+        <w:rPr>
+          <w:rFonts w:hint="default"/>
+        </w:rPr>
+        <w:t>7. Rx cases main meds category wali cheez beech main laani Jahan meds likhi hui hain</w:t>
+      </w:r>
+    </w:p>
+    <w:p>
+      <w:pPr>
+        <w:numPr>
+          <w:ilvl w:val="0"/>
+          <w:numId w:val="1"/>
+        </w:numPr>
+        <w:spacing w:after="100"/>
+        <w:ind w:left="420" w:leftChars="0" w:hanging="420" w:firstLineChars="0"/>
+        <w:rPr>
+          <w:rFonts w:hint="default"/>
+          <w:highlight w:val="yellow"/>
+        </w:rPr>
+      </w:pPr>
+      <w:r>
+        <w:rPr>
+          <w:rFonts w:hint="default"/>
+          <w:highlight w:val="yellow"/>
+        </w:rPr>
+        <w:t>8. First in industry ask about tablet,syrup etc then their types</w:t>
+      </w:r>
+    </w:p>
+    <w:p>
+      <w:pPr>
+        <w:numPr>
+          <w:ilvl w:val="0"/>
+          <w:numId w:val="1"/>
+        </w:numPr>
+        <w:spacing w:after="100"/>
+        <w:ind w:left="420" w:leftChars="0" w:hanging="420" w:firstLineChars="0"/>
+        <w:rPr>
+          <w:rFonts w:hint="default"/>
+          <w:highlight w:val="yellow"/>
+        </w:rPr>
+      </w:pPr>
+      <w:r>
+        <w:rPr>
+          <w:rFonts w:hint="default"/>
+          <w:highlight w:val="yellow"/>
+        </w:rPr>
+        <w:t>9. Back button</w:t>
+      </w:r>
+    </w:p>
+    <w:p>
+      <w:pPr>
+        <w:numPr>
+          <w:ilvl w:val="0"/>
+          <w:numId w:val="1"/>
+        </w:numPr>
+        <w:spacing w:after="100"/>
+        <w:ind w:left="420" w:leftChars="0" w:hanging="420" w:firstLineChars="0"/>
+        <w:rPr>
+          <w:highlight w:val="yellow"/>
         </w:rPr>
       </w:pPr>
       <w:bookmarkStart w:id="0" w:name="_GoBack"/>
-      <w:bookmarkEnd w:id="0"/>
-      <w:r>
-        <w:rPr>
-          <w:rFonts w:hint="default"/>
-        </w:rPr>
-        <w:t>2. only 2 options of student occupation in sign up</w:t>
-      </w:r>
-    </w:p>
-    <w:p>
-      <w:pPr>
-        <w:spacing w:after="100"/>
-        <w:rPr>
-          <w:rFonts w:hint="default"/>
-        </w:rPr>
-      </w:pPr>
-      <w:r>
-        <w:rPr>
-          <w:rFonts w:hint="default"/>
-        </w:rPr>
-        <w:t>3. Tip of the day at the top</w:t>
-      </w:r>
-    </w:p>
-    <w:p>
-      <w:pPr>
-        <w:spacing w:after="100"/>
-        <w:rPr>
-          <w:rFonts w:hint="default"/>
-        </w:rPr>
-      </w:pPr>
-      <w:r>
-        <w:rPr>
-          <w:rFonts w:hint="default"/>
-        </w:rPr>
-        <w:t>4. Prescription sahi krna hai</w:t>
-      </w:r>
-    </w:p>
-    <w:p>
-      <w:pPr>
-        <w:spacing w:after="100"/>
-        <w:rPr>
-          <w:rFonts w:hint="default"/>
-        </w:rPr>
-      </w:pPr>
-      <w:r>
-        <w:rPr>
-          <w:rFonts w:hint="default"/>
-        </w:rPr>
-        <w:t>5. Ticking clock</w:t>
-      </w:r>
-    </w:p>
-    <w:p>
-      <w:pPr>
-        <w:spacing w:after="100"/>
-        <w:rPr>
-          <w:rFonts w:hint="default"/>
-        </w:rPr>
-      </w:pPr>
-      <w:r>
-        <w:rPr>
-          <w:rFonts w:hint="default"/>
-        </w:rPr>
-        <w:t>6. Har mode ka apna aik difficulty level</w:t>
-      </w:r>
-    </w:p>
-    <w:p>
-      <w:pPr>
-        <w:spacing w:after="100"/>
-        <w:rPr>
-          <w:rFonts w:hint="default"/>
-        </w:rPr>
-      </w:pPr>
-      <w:r>
-        <w:rPr>
-          <w:rFonts w:hint="default"/>
-        </w:rPr>
-        <w:t>7. Rx cases main meds category wali cheez beech main laani Jahan meds likhi hui hain</w:t>
-      </w:r>
-    </w:p>
-    <w:p>
-      <w:pPr>
-        <w:spacing w:after="100"/>
-        <w:rPr>
-          <w:rFonts w:hint="default"/>
-        </w:rPr>
-      </w:pPr>
-      <w:r>
-        <w:rPr>
-          <w:rFonts w:hint="default"/>
-        </w:rPr>
-        <w:t>8. First in industry ask about tablet,syrup etc then their types</w:t>
-      </w:r>
-    </w:p>
-    <w:p>
-      <w:pPr>
-        <w:spacing w:after="100"/>
-        <w:rPr>
-          <w:rFonts w:hint="default"/>
-        </w:rPr>
-      </w:pPr>
-      <w:r>
-        <w:rPr>
-          <w:rFonts w:hint="default"/>
-        </w:rPr>
-        <w:t>9. Back button</w:t>
-      </w:r>
-    </w:p>
-    <w:p>
-      <w:pPr>
-        <w:spacing w:after="100"/>
-        <w:rPr>
-          <w:rFonts w:hint="default"/>
-        </w:rPr>
-      </w:pPr>
-      <w:r>
-        <w:rPr>
-          <w:rFonts w:hint="default"/>
-        </w:rPr>
-        <w:t>10. Batch size change krny ka freedom</w:t>
-      </w:r>
-    </w:p>
-    <w:p>
-      <w:pPr>
-        <w:spacing w:after="100"/>
-        <w:rPr>
-          <w:rFonts w:hint="default"/>
-        </w:rPr>
-      </w:pPr>
-      <w:r>
-        <w:rPr>
-          <w:rFonts w:hint="default"/>
-        </w:rPr>
-        <w:t>11. Tutorial wala bot at front and at each mode</w:t>
-      </w:r>
-    </w:p>
-    <w:p>
-      <w:pPr>
-        <w:spacing w:after="100"/>
-      </w:pPr>
-      <w:r>
-        <w:rPr>
-          <w:rFonts w:hint="default"/>
-        </w:rPr>
-        <w:t>12. neon lime green color theme overall</w:t>
-      </w:r>
-    </w:p>
+      <w:r>
+        <w:rPr>
+          <w:rFonts w:hint="default"/>
+          <w:highlight w:val="yellow"/>
+        </w:rPr>
+        <w:t>10. Batch size change krny ka freedo</w:t>
+      </w:r>
+      <w:r>
+        <w:rPr>
+          <w:rFonts w:hint="default"/>
+          <w:highlight w:val="yellow"/>
+          <w:lang w:val="en-US"/>
+        </w:rPr>
+        <w:t>m</w:t>
+      </w:r>
+    </w:p>
+    <w:bookmarkEnd w:id="0"/>
     <w:sectPr>
       <w:pgSz w:w="12240" w:h="15840"/>
       <w:pgMar w:top="1440" w:right="1440" w:bottom="1440" w:left="1440" w:header="708" w:footer="708" w:gutter="0"/>
@@ -635,174 +757,19 @@
 <file path=word/numbering.xml><?xml version="1.0" encoding="utf-8"?>
 <w:numbering xmlns:wpc="http://schemas.microsoft.com/office/word/2010/wordprocessingCanvas" xmlns:mc="http://schemas.openxmlformats.org/markup-compatibility/2006" xmlns:o="urn:schemas-microsoft-com:office:office" xmlns:r="http://schemas.openxmlformats.org/officeDocument/2006/relationships" xmlns:m="http://schemas.openxmlformats.org/officeDocument/2006/math" xmlns:v="urn:schemas-microsoft-com:vml" xmlns:wp14="http://schemas.microsoft.com/office/word/2010/wordprocessingDrawing" xmlns:wp="http://schemas.openxmlformats.org/drawingml/2006/wordprocessingDrawing" xmlns:w10="urn:schemas-microsoft-com:office:word" xmlns:w="http://schemas.openxmlformats.org/wordprocessingml/2006/main" xmlns:w14="http://schemas.microsoft.com/office/word/2010/wordml" xmlns:wpg="http://schemas.microsoft.com/office/word/2010/wordprocessingGroup" xmlns:wpi="http://schemas.microsoft.com/office/word/2010/wordprocessingInk" xmlns:wne="http://schemas.microsoft.com/office/word/2006/wordml" xmlns:wps="http://schemas.microsoft.com/office/word/2010/wordprocessingShape" xmlns:wpsCustomData="http://www.wps.cn/officeDocument/2013/wpsCustomData" mc:Ignorable="w14 wp14">
   <w:abstractNum w:abstractNumId="0">
-    <w:nsid w:val="69507706"/>
-    <w:multiLevelType w:val="multilevel"/>
-    <w:tmpl w:val="69507706"/>
+    <w:nsid w:val="380271B6"/>
+    <w:multiLevelType w:val="singleLevel"/>
+    <w:tmpl w:val="380271B6"/>
     <w:lvl w:ilvl="0" w:tentative="0">
       <w:start w:val="1"/>
       <w:numFmt w:val="bullet"/>
-      <w:lvlText w:val="•"/>
+      <w:lvlText w:val=""/>
       <w:lvlJc w:val="left"/>
       <w:pPr>
-        <w:ind w:left="720" w:hanging="360"/>
-      </w:pPr>
-    </w:lvl>
-    <w:lvl w:ilvl="1" w:tentative="0">
-      <w:start w:val="0"/>
-      <w:numFmt w:val="decimal"/>
-      <w:lvlText w:val=""/>
-      <w:lvlJc w:val="left"/>
-    </w:lvl>
-    <w:lvl w:ilvl="2" w:tentative="0">
-      <w:start w:val="0"/>
-      <w:numFmt w:val="decimal"/>
-      <w:lvlText w:val=""/>
-      <w:lvlJc w:val="left"/>
-    </w:lvl>
-    <w:lvl w:ilvl="3" w:tentative="0">
-      <w:start w:val="0"/>
-      <w:numFmt w:val="decimal"/>
-      <w:lvlText w:val=""/>
-      <w:lvlJc w:val="left"/>
-    </w:lvl>
-    <w:lvl w:ilvl="4" w:tentative="0">
-      <w:start w:val="0"/>
-      <w:numFmt w:val="decimal"/>
-      <w:lvlText w:val=""/>
-      <w:lvlJc w:val="left"/>
-    </w:lvl>
-    <w:lvl w:ilvl="5" w:tentative="0">
-      <w:start w:val="0"/>
-      <w:numFmt w:val="decimal"/>
-      <w:lvlText w:val=""/>
-      <w:lvlJc w:val="left"/>
-    </w:lvl>
-    <w:lvl w:ilvl="6" w:tentative="0">
-      <w:start w:val="0"/>
-      <w:numFmt w:val="decimal"/>
-      <w:lvlText w:val=""/>
-      <w:lvlJc w:val="left"/>
-    </w:lvl>
-    <w:lvl w:ilvl="7" w:tentative="0">
-      <w:start w:val="0"/>
-      <w:numFmt w:val="decimal"/>
-      <w:lvlText w:val=""/>
-      <w:lvlJc w:val="left"/>
-    </w:lvl>
-    <w:lvl w:ilvl="8" w:tentative="0">
-      <w:start w:val="0"/>
-      <w:numFmt w:val="decimal"/>
-      <w:lvlText w:val=""/>
-      <w:lvlJc w:val="left"/>
-    </w:lvl>
-  </w:abstractNum>
-  <w:abstractNum w:abstractNumId="1">
-    <w:nsid w:val="7362449B"/>
-    <w:multiLevelType w:val="multilevel"/>
-    <w:tmpl w:val="7362449B"/>
-    <w:lvl w:ilvl="0" w:tentative="0">
-      <w:start w:val="1"/>
-      <w:numFmt w:val="bullet"/>
-      <w:lvlText w:val=""/>
-      <w:lvlJc w:val="left"/>
-      <w:pPr>
-        <w:ind w:left="1440" w:hanging="360"/>
-      </w:pPr>
-      <w:rPr>
-        <w:rFonts w:hint="default" w:ascii="Symbol" w:hAnsi="Symbol"/>
-      </w:rPr>
-    </w:lvl>
-    <w:lvl w:ilvl="1" w:tentative="0">
-      <w:start w:val="1"/>
-      <w:numFmt w:val="bullet"/>
-      <w:lvlText w:val="o"/>
-      <w:lvlJc w:val="left"/>
-      <w:pPr>
-        <w:ind w:left="2160" w:hanging="360"/>
-      </w:pPr>
-      <w:rPr>
-        <w:rFonts w:hint="default" w:ascii="Courier New" w:hAnsi="Courier New" w:cs="Courier New"/>
-      </w:rPr>
-    </w:lvl>
-    <w:lvl w:ilvl="2" w:tentative="0">
-      <w:start w:val="1"/>
-      <w:numFmt w:val="bullet"/>
-      <w:lvlText w:val=""/>
-      <w:lvlJc w:val="left"/>
-      <w:pPr>
-        <w:ind w:left="2880" w:hanging="360"/>
-      </w:pPr>
-      <w:rPr>
-        <w:rFonts w:hint="default" w:ascii="Wingdings" w:hAnsi="Wingdings"/>
-      </w:rPr>
-    </w:lvl>
-    <w:lvl w:ilvl="3" w:tentative="0">
-      <w:start w:val="1"/>
-      <w:numFmt w:val="bullet"/>
-      <w:lvlText w:val=""/>
-      <w:lvlJc w:val="left"/>
-      <w:pPr>
-        <w:ind w:left="3600" w:hanging="360"/>
-      </w:pPr>
-      <w:rPr>
-        <w:rFonts w:hint="default" w:ascii="Symbol" w:hAnsi="Symbol"/>
-      </w:rPr>
-    </w:lvl>
-    <w:lvl w:ilvl="4" w:tentative="0">
-      <w:start w:val="1"/>
-      <w:numFmt w:val="bullet"/>
-      <w:lvlText w:val="o"/>
-      <w:lvlJc w:val="left"/>
-      <w:pPr>
-        <w:ind w:left="4320" w:hanging="360"/>
-      </w:pPr>
-      <w:rPr>
-        <w:rFonts w:hint="default" w:ascii="Courier New" w:hAnsi="Courier New" w:cs="Courier New"/>
-      </w:rPr>
-    </w:lvl>
-    <w:lvl w:ilvl="5" w:tentative="0">
-      <w:start w:val="1"/>
-      <w:numFmt w:val="bullet"/>
-      <w:lvlText w:val=""/>
-      <w:lvlJc w:val="left"/>
-      <w:pPr>
-        <w:ind w:left="5040" w:hanging="360"/>
-      </w:pPr>
-      <w:rPr>
-        <w:rFonts w:hint="default" w:ascii="Wingdings" w:hAnsi="Wingdings"/>
-      </w:rPr>
-    </w:lvl>
-    <w:lvl w:ilvl="6" w:tentative="0">
-      <w:start w:val="1"/>
-      <w:numFmt w:val="bullet"/>
-      <w:lvlText w:val=""/>
-      <w:lvlJc w:val="left"/>
-      <w:pPr>
-        <w:ind w:left="5760" w:hanging="360"/>
-      </w:pPr>
-      <w:rPr>
-        <w:rFonts w:hint="default" w:ascii="Symbol" w:hAnsi="Symbol"/>
-      </w:rPr>
-    </w:lvl>
-    <w:lvl w:ilvl="7" w:tentative="0">
-      <w:start w:val="1"/>
-      <w:numFmt w:val="bullet"/>
-      <w:lvlText w:val="o"/>
-      <w:lvlJc w:val="left"/>
-      <w:pPr>
-        <w:ind w:left="6480" w:hanging="360"/>
-      </w:pPr>
-      <w:rPr>
-        <w:rFonts w:hint="default" w:ascii="Courier New" w:hAnsi="Courier New" w:cs="Courier New"/>
-      </w:rPr>
-    </w:lvl>
-    <w:lvl w:ilvl="8" w:tentative="0">
-      <w:start w:val="1"/>
-      <w:numFmt w:val="bullet"/>
-      <w:lvlText w:val=""/>
-      <w:lvlJc w:val="left"/>
-      <w:pPr>
-        <w:ind w:left="7200" w:hanging="360"/>
+        <w:tabs>
+          <w:tab w:val="left" w:pos="420"/>
+        </w:tabs>
+        <w:ind w:left="420" w:leftChars="0" w:hanging="420" w:firstLineChars="0"/>
       </w:pPr>
       <w:rPr>
         <w:rFonts w:hint="default" w:ascii="Wingdings" w:hAnsi="Wingdings"/>
@@ -811,12 +778,6 @@
   </w:abstractNum>
   <w:num w:numId="1">
     <w:abstractNumId w:val="0"/>
-    <w:lvlOverride w:ilvl="0">
-      <w:startOverride w:val="1"/>
-    </w:lvlOverride>
-  </w:num>
-  <w:num w:numId="2">
-    <w:abstractNumId w:val="1"/>
   </w:num>
 </w:numbering>
 </file>
@@ -870,7 +831,7 @@
     <w:lsdException w:uiPriority="99" w:name="table of figures"/>
     <w:lsdException w:uiPriority="99" w:name="envelope address"/>
     <w:lsdException w:uiPriority="99" w:name="envelope return"/>
-    <w:lsdException w:uiPriority="99" w:name="footnote reference"/>
+    <w:lsdException w:qFormat="1" w:uiPriority="99" w:name="footnote reference"/>
     <w:lsdException w:uiPriority="99" w:name="annotation reference"/>
     <w:lsdException w:uiPriority="99" w:name="line number"/>
     <w:lsdException w:uiPriority="99" w:name="page number"/>
@@ -917,7 +878,7 @@
     <w:lsdException w:uiPriority="99" w:name="Body Text Indent 2"/>
     <w:lsdException w:uiPriority="99" w:name="Body Text Indent 3"/>
     <w:lsdException w:uiPriority="99" w:name="Block Text"/>
-    <w:lsdException w:uiPriority="99" w:semiHidden="0" w:name="Hyperlink"/>
+    <w:lsdException w:qFormat="1" w:uiPriority="99" w:semiHidden="0" w:name="Hyperlink"/>
     <w:lsdException w:uiPriority="99" w:name="FollowedHyperlink"/>
     <w:lsdException w:qFormat="1" w:unhideWhenUsed="0" w:uiPriority="22" w:semiHidden="0" w:name="Strong"/>
     <w:lsdException w:qFormat="1" w:unhideWhenUsed="0" w:uiPriority="20" w:semiHidden="0" w:name="Emphasis"/>
@@ -1244,6 +1205,7 @@
     <w:name w:val="footnote reference"/>
     <w:semiHidden/>
     <w:unhideWhenUsed/>
+    <w:qFormat/>
     <w:uiPriority w:val="99"/>
     <w:rPr>
       <w:vertAlign w:val="superscript"/>
@@ -1266,6 +1228,7 @@
   <w:style w:type="character" w:styleId="14">
     <w:name w:val="Hyperlink"/>
     <w:unhideWhenUsed/>
+    <w:qFormat/>
     <w:uiPriority w:val="99"/>
     <w:rPr>
       <w:color w:val="0563C1"/>
@@ -1312,6 +1275,7 @@
     <w:link w:val="13"/>
     <w:semiHidden/>
     <w:unhideWhenUsed/>
+    <w:qFormat/>
     <w:uiPriority w:val="99"/>
     <w:rPr>
       <w:sz w:val="20"/>

</xml_diff>